<commit_message>
Added from automation repo
</commit_message>
<xml_diff>
--- a/NZ Payroll Testing Experience.docx
+++ b/NZ Payroll Testing Experience.docx
@@ -243,7 +243,7 @@
           <w:b/>
           <w:bCs/>
         </w:rPr>
-        <w:t xml:space="preserve">Leave calculations including OWP, AWE, RDP vs ADP logic validation </w:t>
+        <w:t>Leave calculations including OWP, AWE, RDP vs ADP logic validation</w:t>
       </w:r>
     </w:p>
     <w:p>
@@ -264,7 +264,15 @@
           <w:b/>
           <w:bCs/>
         </w:rPr>
-        <w:t xml:space="preserve">Payroll configuration testing (tax codes, earnings, work patterns, employee setup) </w:t>
+        <w:t>Holidays Act leave-rate calculation and entitlement validation</w:t>
+      </w:r>
+      <w:r>
+        <w:rPr>
+          <w:rFonts w:ascii="Segoe UI Emoji" w:hAnsi="Segoe UI Emoji" w:cs="Segoe UI Emoji"/>
+          <w:b/>
+          <w:bCs/>
+        </w:rPr>
+        <w:t xml:space="preserve"> </w:t>
       </w:r>
     </w:p>
     <w:p>
@@ -285,7 +293,7 @@
           <w:b/>
           <w:bCs/>
         </w:rPr>
-        <w:t xml:space="preserve">Final pay and termination payout validation including statutory entitlements </w:t>
+        <w:t xml:space="preserve">Payroll configuration testing (tax codes, earnings, work patterns, employee setup) </w:t>
       </w:r>
     </w:p>
     <w:p>
@@ -306,6 +314,27 @@
           <w:b/>
           <w:bCs/>
         </w:rPr>
+        <w:t xml:space="preserve">Final pay and termination payout validation including statutory entitlements </w:t>
+      </w:r>
+    </w:p>
+    <w:p>
+      <w:pPr>
+        <w:numPr>
+          <w:ilvl w:val="0"/>
+          <w:numId w:val="19"/>
+        </w:numPr>
+        <w:rPr>
+          <w:rFonts w:ascii="Segoe UI Emoji" w:hAnsi="Segoe UI Emoji" w:cs="Segoe UI Emoji"/>
+          <w:b/>
+          <w:bCs/>
+        </w:rPr>
+      </w:pPr>
+      <w:r>
+        <w:rPr>
+          <w:rFonts w:ascii="Segoe UI Emoji" w:hAnsi="Segoe UI Emoji" w:cs="Segoe UI Emoji"/>
+          <w:b/>
+          <w:bCs/>
+        </w:rPr>
         <w:t xml:space="preserve">Edge-case payroll scenarios (variable hours, casuals, missing work patterns) </w:t>
       </w:r>
     </w:p>
@@ -384,7 +413,7 @@
           <w:b/>
           <w:bCs/>
         </w:rPr>
-        <w:t xml:space="preserve">Identification of RDP vs ADP differences in leave and termination payments </w:t>
+        <w:t xml:space="preserve">Root-cause analysis of payroll miscalculations and configuration defects </w:t>
       </w:r>
     </w:p>
     <w:p>
@@ -405,7 +434,7 @@
           <w:b/>
           <w:bCs/>
         </w:rPr>
-        <w:t xml:space="preserve">Root-cause analysis of payroll miscalculations and configuration defects </w:t>
+        <w:t xml:space="preserve">Cross-validation of UI outputs vs expected payroll engine calculations </w:t>
       </w:r>
     </w:p>
     <w:p>
@@ -426,7 +455,7 @@
           <w:b/>
           <w:bCs/>
         </w:rPr>
-        <w:t xml:space="preserve">Cross-validation of UI outputs vs expected payroll engine calculations </w:t>
+        <w:t xml:space="preserve">Detection of inconsistencies across earnings, leave, and tax components </w:t>
       </w:r>
     </w:p>
     <w:p>
@@ -447,17 +476,29 @@
           <w:b/>
           <w:bCs/>
         </w:rPr>
-        <w:t xml:space="preserve">Detection of inconsistencies across earnings, leave, and tax components </w:t>
-      </w:r>
-    </w:p>
-    <w:p>
-      <w:pPr>
-        <w:rPr>
-          <w:rFonts w:ascii="Segoe UI Emoji" w:hAnsi="Segoe UI Emoji" w:cs="Segoe UI Emoji"/>
-          <w:b/>
-          <w:bCs/>
-        </w:rPr>
-      </w:pPr>
+        <w:t xml:space="preserve">Analysis and reconciliation of payroll calculation variances across employee scenarios </w:t>
+      </w:r>
+    </w:p>
+    <w:p>
+      <w:pPr>
+        <w:numPr>
+          <w:ilvl w:val="0"/>
+          <w:numId w:val="20"/>
+        </w:numPr>
+        <w:rPr>
+          <w:rFonts w:ascii="Segoe UI Emoji" w:hAnsi="Segoe UI Emoji" w:cs="Segoe UI Emoji"/>
+          <w:b/>
+          <w:bCs/>
+        </w:rPr>
+      </w:pPr>
+      <w:r>
+        <w:rPr>
+          <w:rFonts w:ascii="Segoe UI Emoji" w:hAnsi="Segoe UI Emoji" w:cs="Segoe UI Emoji"/>
+          <w:b/>
+          <w:bCs/>
+        </w:rPr>
+        <w:t>Validation of payroll calculation outputs following configuration or data changes</w:t>
+      </w:r>
       <w:r>
         <w:rPr>
           <w:rFonts w:ascii="Segoe UI Emoji" w:hAnsi="Segoe UI Emoji" w:cs="Segoe UI Emoji"/>
@@ -465,7 +506,7 @@
           <w:bCs/>
         </w:rPr>
         <w:pict w14:anchorId="448C5A05">
-          <v:rect id="_x0000_i1028" style="width:0;height:1.5pt" o:hralign="center" o:hrstd="t" o:hr="t" fillcolor="#a0a0a0" stroked="f"/>
+          <v:rect id="_x0000_i1046" style="width:0;height:1.5pt" o:hralign="center" o:hrstd="t" o:hr="t" fillcolor="#a0a0a0" stroked="f"/>
         </w:pict>
       </w:r>
     </w:p>
@@ -483,7 +524,28 @@
           <w:b/>
           <w:bCs/>
         </w:rPr>
-        <w:t>🌐 API &amp; INTEGRATION TESTING (EMPLOYER SERVICES / ACUMATICA DCE)</w:t>
+        <w:t>⚖️ HOLIDAYS ACT COMPLIANCE &amp; AUTOMATED VALIDATION</w:t>
+      </w:r>
+    </w:p>
+    <w:p>
+      <w:pPr>
+        <w:numPr>
+          <w:ilvl w:val="0"/>
+          <w:numId w:val="20"/>
+        </w:numPr>
+        <w:rPr>
+          <w:rFonts w:ascii="Segoe UI Emoji" w:hAnsi="Segoe UI Emoji" w:cs="Segoe UI Emoji"/>
+          <w:b/>
+          <w:bCs/>
+        </w:rPr>
+      </w:pPr>
+      <w:r>
+        <w:rPr>
+          <w:rFonts w:ascii="Segoe UI Emoji" w:hAnsi="Segoe UI Emoji" w:cs="Segoe UI Emoji"/>
+          <w:b/>
+          <w:bCs/>
+        </w:rPr>
+        <w:t xml:space="preserve">Automated testing of NZ Holidays Act 2003 leave-calculation scenarios </w:t>
       </w:r>
     </w:p>
     <w:p>
@@ -504,23 +566,8 @@
           <w:b/>
           <w:bCs/>
         </w:rPr>
-        <w:t xml:space="preserve">API-based </w:t>
-      </w:r>
-      <w:r>
-        <w:rPr>
-          <w:rFonts w:ascii="Segoe UI Emoji" w:hAnsi="Segoe UI Emoji" w:cs="Segoe UI Emoji"/>
-          <w:b/>
-          <w:bCs/>
-        </w:rPr>
-        <w:t>income</w:t>
-      </w:r>
-      <w:r>
-        <w:rPr>
-          <w:rFonts w:ascii="Segoe UI Emoji" w:hAnsi="Segoe UI Emoji" w:cs="Segoe UI Emoji"/>
-          <w:b/>
-          <w:bCs/>
-        </w:rPr>
-        <w:t xml:space="preserve"> tax validation via HTTP POST requests </w:t>
+        <w:lastRenderedPageBreak/>
+        <w:t xml:space="preserve">Validation of Ordinary Weekly Pay (OWP), Relevant Daily Pay (RDP) and Average Daily Pay (ADP) calculations </w:t>
       </w:r>
     </w:p>
     <w:p>
@@ -541,7 +588,7 @@
           <w:b/>
           <w:bCs/>
         </w:rPr>
-        <w:t xml:space="preserve">PAYE calculation verification across tax codes and pay frequencies </w:t>
+        <w:t xml:space="preserve">Validation of RDP vs ADP calculation pathways and system decision logic </w:t>
       </w:r>
     </w:p>
     <w:p>
@@ -562,7 +609,7 @@
           <w:b/>
           <w:bCs/>
         </w:rPr>
-        <w:t xml:space="preserve">Validation of frequency conversions (weekly / fortnightly / monthly models) </w:t>
+        <w:t xml:space="preserve">Validation of historical gross earnings and work-pattern data used in leave calculations </w:t>
       </w:r>
     </w:p>
     <w:p>
@@ -583,8 +630,7 @@
           <w:b/>
           <w:bCs/>
         </w:rPr>
-        <w:lastRenderedPageBreak/>
-        <w:t xml:space="preserve">Cross-system reconciliation of API vs UI payroll outputs </w:t>
+        <w:t xml:space="preserve">Testing of consistent and variable work-pattern scenarios </w:t>
       </w:r>
     </w:p>
     <w:p>
@@ -605,6 +651,265 @@
           <w:b/>
           <w:bCs/>
         </w:rPr>
+        <w:t xml:space="preserve">Validation of annual leave, </w:t>
+      </w:r>
+      <w:r>
+        <w:rPr>
+          <w:rFonts w:ascii="Segoe UI Emoji" w:hAnsi="Segoe UI Emoji" w:cs="Segoe UI Emoji"/>
+          <w:b/>
+          <w:bCs/>
+        </w:rPr>
+        <w:t>FBAPS</w:t>
+      </w:r>
+      <w:r>
+        <w:rPr>
+          <w:rFonts w:ascii="Segoe UI Emoji" w:hAnsi="Segoe UI Emoji" w:cs="Segoe UI Emoji"/>
+          <w:b/>
+          <w:bCs/>
+        </w:rPr>
+        <w:t xml:space="preserve"> leave and final-pay processing </w:t>
+      </w:r>
+    </w:p>
+    <w:p>
+      <w:pPr>
+        <w:numPr>
+          <w:ilvl w:val="0"/>
+          <w:numId w:val="21"/>
+        </w:numPr>
+        <w:rPr>
+          <w:rFonts w:ascii="Segoe UI Emoji" w:hAnsi="Segoe UI Emoji" w:cs="Segoe UI Emoji"/>
+          <w:b/>
+          <w:bCs/>
+        </w:rPr>
+      </w:pPr>
+      <w:r>
+        <w:rPr>
+          <w:rFonts w:ascii="Segoe UI Emoji" w:hAnsi="Segoe UI Emoji" w:cs="Segoe UI Emoji"/>
+          <w:b/>
+          <w:bCs/>
+        </w:rPr>
+        <w:t xml:space="preserve">Verification of leave-rate calculation inputs and resulting statutory payment outcomes </w:t>
+      </w:r>
+    </w:p>
+    <w:p>
+      <w:pPr>
+        <w:numPr>
+          <w:ilvl w:val="0"/>
+          <w:numId w:val="21"/>
+        </w:numPr>
+        <w:rPr>
+          <w:rFonts w:ascii="Segoe UI Emoji" w:hAnsi="Segoe UI Emoji" w:cs="Segoe UI Emoji"/>
+          <w:b/>
+          <w:bCs/>
+        </w:rPr>
+      </w:pPr>
+      <w:r>
+        <w:rPr>
+          <w:rFonts w:ascii="Segoe UI Emoji" w:hAnsi="Segoe UI Emoji" w:cs="Segoe UI Emoji"/>
+          <w:b/>
+          <w:bCs/>
+        </w:rPr>
+        <w:t xml:space="preserve">Testing of employee configurations affecting statutory leave calculations </w:t>
+      </w:r>
+    </w:p>
+    <w:p>
+      <w:pPr>
+        <w:numPr>
+          <w:ilvl w:val="0"/>
+          <w:numId w:val="21"/>
+        </w:numPr>
+        <w:rPr>
+          <w:rFonts w:ascii="Segoe UI Emoji" w:hAnsi="Segoe UI Emoji" w:cs="Segoe UI Emoji"/>
+          <w:b/>
+          <w:bCs/>
+        </w:rPr>
+      </w:pPr>
+      <w:r>
+        <w:rPr>
+          <w:rFonts w:ascii="Segoe UI Emoji" w:hAnsi="Segoe UI Emoji" w:cs="Segoe UI Emoji"/>
+          <w:b/>
+          <w:bCs/>
+        </w:rPr>
+        <w:t xml:space="preserve">Edge-case testing involving casual employees, variable hours and missing work patterns </w:t>
+      </w:r>
+    </w:p>
+    <w:p>
+      <w:pPr>
+        <w:numPr>
+          <w:ilvl w:val="0"/>
+          <w:numId w:val="21"/>
+        </w:numPr>
+        <w:rPr>
+          <w:rFonts w:ascii="Segoe UI Emoji" w:hAnsi="Segoe UI Emoji" w:cs="Segoe UI Emoji"/>
+          <w:b/>
+          <w:bCs/>
+        </w:rPr>
+      </w:pPr>
+      <w:r>
+        <w:rPr>
+          <w:rFonts w:ascii="Segoe UI Emoji" w:hAnsi="Segoe UI Emoji" w:cs="Segoe UI Emoji"/>
+          <w:b/>
+          <w:bCs/>
+        </w:rPr>
+        <w:t>GUI automation of end-to-end statutory leave workflows from employee setup through payroll calculation and final payment</w:t>
+      </w:r>
+    </w:p>
+    <w:p>
+      <w:pPr>
+        <w:numPr>
+          <w:ilvl w:val="0"/>
+          <w:numId w:val="20"/>
+        </w:numPr>
+        <w:rPr>
+          <w:rFonts w:ascii="Segoe UI Emoji" w:hAnsi="Segoe UI Emoji" w:cs="Segoe UI Emoji"/>
+          <w:b/>
+          <w:bCs/>
+        </w:rPr>
+      </w:pPr>
+    </w:p>
+    <w:p>
+      <w:pPr>
+        <w:rPr>
+          <w:rFonts w:ascii="Segoe UI Emoji" w:hAnsi="Segoe UI Emoji" w:cs="Segoe UI Emoji"/>
+          <w:b/>
+          <w:bCs/>
+        </w:rPr>
+      </w:pPr>
+      <w:r>
+        <w:rPr>
+          <w:rFonts w:ascii="Segoe UI Emoji" w:hAnsi="Segoe UI Emoji" w:cs="Segoe UI Emoji"/>
+          <w:b/>
+          <w:bCs/>
+        </w:rPr>
+        <w:t>🌐 API &amp; INTEGRATION TESTING (EMPLOYER SERVICES / ACUMATICA DCE)</w:t>
+      </w:r>
+    </w:p>
+    <w:p>
+      <w:pPr>
+        <w:numPr>
+          <w:ilvl w:val="0"/>
+          <w:numId w:val="21"/>
+        </w:numPr>
+        <w:rPr>
+          <w:rFonts w:ascii="Segoe UI Emoji" w:hAnsi="Segoe UI Emoji" w:cs="Segoe UI Emoji"/>
+          <w:b/>
+          <w:bCs/>
+        </w:rPr>
+      </w:pPr>
+      <w:r>
+        <w:rPr>
+          <w:rFonts w:ascii="Segoe UI Emoji" w:hAnsi="Segoe UI Emoji" w:cs="Segoe UI Emoji"/>
+          <w:b/>
+          <w:bCs/>
+        </w:rPr>
+        <w:t xml:space="preserve">API-based </w:t>
+      </w:r>
+      <w:r>
+        <w:rPr>
+          <w:rFonts w:ascii="Segoe UI Emoji" w:hAnsi="Segoe UI Emoji" w:cs="Segoe UI Emoji"/>
+          <w:b/>
+          <w:bCs/>
+        </w:rPr>
+        <w:t>income</w:t>
+      </w:r>
+      <w:r>
+        <w:rPr>
+          <w:rFonts w:ascii="Segoe UI Emoji" w:hAnsi="Segoe UI Emoji" w:cs="Segoe UI Emoji"/>
+          <w:b/>
+          <w:bCs/>
+        </w:rPr>
+        <w:t xml:space="preserve"> tax validation via HTTP POST requests </w:t>
+      </w:r>
+      <w:r>
+        <w:rPr>
+          <w:rFonts w:ascii="Segoe UI Emoji" w:hAnsi="Segoe UI Emoji" w:cs="Segoe UI Emoji"/>
+          <w:b/>
+          <w:bCs/>
+        </w:rPr>
+        <w:t>(VBScript)</w:t>
+      </w:r>
+    </w:p>
+    <w:p>
+      <w:pPr>
+        <w:numPr>
+          <w:ilvl w:val="0"/>
+          <w:numId w:val="21"/>
+        </w:numPr>
+        <w:rPr>
+          <w:rFonts w:ascii="Segoe UI Emoji" w:hAnsi="Segoe UI Emoji" w:cs="Segoe UI Emoji"/>
+          <w:b/>
+          <w:bCs/>
+        </w:rPr>
+      </w:pPr>
+      <w:r>
+        <w:rPr>
+          <w:rFonts w:ascii="Segoe UI Emoji" w:hAnsi="Segoe UI Emoji" w:cs="Segoe UI Emoji"/>
+          <w:b/>
+          <w:bCs/>
+        </w:rPr>
+        <w:t xml:space="preserve">PAYE calculation verification across tax codes and pay frequencies </w:t>
+      </w:r>
+    </w:p>
+    <w:p>
+      <w:pPr>
+        <w:numPr>
+          <w:ilvl w:val="0"/>
+          <w:numId w:val="21"/>
+        </w:numPr>
+        <w:rPr>
+          <w:rFonts w:ascii="Segoe UI Emoji" w:hAnsi="Segoe UI Emoji" w:cs="Segoe UI Emoji"/>
+          <w:b/>
+          <w:bCs/>
+        </w:rPr>
+      </w:pPr>
+      <w:r>
+        <w:rPr>
+          <w:rFonts w:ascii="Segoe UI Emoji" w:hAnsi="Segoe UI Emoji" w:cs="Segoe UI Emoji"/>
+          <w:b/>
+          <w:bCs/>
+        </w:rPr>
+        <w:t xml:space="preserve">Validation of frequency conversions (weekly / fortnightly / monthly models) </w:t>
+      </w:r>
+    </w:p>
+    <w:p>
+      <w:pPr>
+        <w:numPr>
+          <w:ilvl w:val="0"/>
+          <w:numId w:val="21"/>
+        </w:numPr>
+        <w:rPr>
+          <w:rFonts w:ascii="Segoe UI Emoji" w:hAnsi="Segoe UI Emoji" w:cs="Segoe UI Emoji"/>
+          <w:b/>
+          <w:bCs/>
+        </w:rPr>
+      </w:pPr>
+      <w:r>
+        <w:rPr>
+          <w:rFonts w:ascii="Segoe UI Emoji" w:hAnsi="Segoe UI Emoji" w:cs="Segoe UI Emoji"/>
+          <w:b/>
+          <w:bCs/>
+        </w:rPr>
+        <w:t xml:space="preserve">Cross-system reconciliation of API vs UI payroll outputs </w:t>
+      </w:r>
+    </w:p>
+    <w:p>
+      <w:pPr>
+        <w:numPr>
+          <w:ilvl w:val="0"/>
+          <w:numId w:val="21"/>
+        </w:numPr>
+        <w:rPr>
+          <w:rFonts w:ascii="Segoe UI Emoji" w:hAnsi="Segoe UI Emoji" w:cs="Segoe UI Emoji"/>
+          <w:b/>
+          <w:bCs/>
+        </w:rPr>
+      </w:pPr>
+      <w:r>
+        <w:rPr>
+          <w:rFonts w:ascii="Segoe UI Emoji" w:hAnsi="Segoe UI Emoji" w:cs="Segoe UI Emoji"/>
+          <w:b/>
+          <w:bCs/>
+        </w:rPr>
         <w:t xml:space="preserve">Data integrity validation across integrated payroll services </w:t>
       </w:r>
     </w:p>
@@ -662,7 +967,23 @@
           <w:b/>
           <w:bCs/>
         </w:rPr>
-        <w:t xml:space="preserve">Full NZ tax code coverage: M, ME, M SL, ME SL, S/SH/ST/SA variants </w:t>
+        <w:t>Full NZ tax code coverage: M, ME, M SL, ME SL, S</w:t>
+      </w:r>
+      <w:r>
+        <w:rPr>
+          <w:rFonts w:ascii="Segoe UI Emoji" w:hAnsi="Segoe UI Emoji" w:cs="Segoe UI Emoji"/>
+          <w:b/>
+          <w:bCs/>
+        </w:rPr>
+        <w:t>B/S</w:t>
+      </w:r>
+      <w:r>
+        <w:rPr>
+          <w:rFonts w:ascii="Segoe UI Emoji" w:hAnsi="Segoe UI Emoji" w:cs="Segoe UI Emoji"/>
+          <w:b/>
+          <w:bCs/>
+        </w:rPr>
+        <w:t xml:space="preserve">/SH/ST/SA variants </w:t>
       </w:r>
     </w:p>
     <w:p>
@@ -824,6 +1145,7 @@
           <w:b/>
           <w:bCs/>
         </w:rPr>
+        <w:lastRenderedPageBreak/>
         <w:t xml:space="preserve">Employee setup validation (tax, pay frequency, KiwiSaver, earnings rules) </w:t>
       </w:r>
     </w:p>
@@ -1106,7 +1428,41 @@
           <w:b/>
           <w:bCs/>
         </w:rPr>
-        <w:t xml:space="preserve">UI automation of payroll and employee self-service workflows, including pay runs, leave, timesheets and termination </w:t>
+        <w:t xml:space="preserve">UI automation </w:t>
+      </w:r>
+      <w:r>
+        <w:rPr>
+          <w:rFonts w:ascii="Segoe UI Emoji" w:hAnsi="Segoe UI Emoji" w:cs="Segoe UI Emoji"/>
+          <w:b/>
+          <w:bCs/>
+        </w:rPr>
+        <w:t xml:space="preserve">(Selenium </w:t>
+      </w:r>
+      <w:proofErr w:type="spellStart"/>
+      <w:r>
+        <w:rPr>
+          <w:rFonts w:ascii="Segoe UI Emoji" w:hAnsi="Segoe UI Emoji" w:cs="Segoe UI Emoji"/>
+          <w:b/>
+          <w:bCs/>
+        </w:rPr>
+        <w:t>Webdriver</w:t>
+      </w:r>
+      <w:proofErr w:type="spellEnd"/>
+      <w:r>
+        <w:rPr>
+          <w:rFonts w:ascii="Segoe UI Emoji" w:hAnsi="Segoe UI Emoji" w:cs="Segoe UI Emoji"/>
+          <w:b/>
+          <w:bCs/>
+        </w:rPr>
+        <w:t xml:space="preserve">) </w:t>
+      </w:r>
+      <w:r>
+        <w:rPr>
+          <w:rFonts w:ascii="Segoe UI Emoji" w:hAnsi="Segoe UI Emoji" w:cs="Segoe UI Emoji"/>
+          <w:b/>
+          <w:bCs/>
+        </w:rPr>
+        <w:t xml:space="preserve">of payroll and employee self-service workflows, including pay runs, leave, timesheets and termination </w:t>
       </w:r>
     </w:p>
     <w:p>
@@ -1148,7 +1504,6 @@
           <w:b/>
           <w:bCs/>
         </w:rPr>
-        <w:lastRenderedPageBreak/>
         <w:t xml:space="preserve">Role-based workflow simulation covering employee, manager and administrator scenarios </w:t>
       </w:r>
     </w:p>
@@ -1296,6 +1651,7 @@
           <w:b/>
           <w:bCs/>
         </w:rPr>
+        <w:lastRenderedPageBreak/>
         <w:t>Testing of portal-to-payroll workflows, from employee transaction submission through to payroll import and resulting transaction data</w:t>
       </w:r>
     </w:p>
@@ -1621,7 +1977,6 @@
           <w:b/>
           <w:bCs/>
         </w:rPr>
-        <w:lastRenderedPageBreak/>
         <w:pict w14:anchorId="022F6DE1">
           <v:rect id="_x0000_i1036" style="width:0;height:1.5pt" o:hralign="center" o:hrstd="t" o:hr="t" fillcolor="#a0a0a0" stroked="f"/>
         </w:pict>
@@ -2972,6 +3327,155 @@
     </w:lvl>
   </w:abstractNum>
   <w:abstractNum w:abstractNumId="8" w15:restartNumberingAfterBreak="0">
+    <w:nsid w:val="19C018AC"/>
+    <w:multiLevelType w:val="multilevel"/>
+    <w:tmpl w:val="42E241C0"/>
+    <w:lvl w:ilvl="0">
+      <w:start w:val="1"/>
+      <w:numFmt w:val="bullet"/>
+      <w:lvlText w:val=""/>
+      <w:lvlJc w:val="left"/>
+      <w:pPr>
+        <w:tabs>
+          <w:tab w:val="num" w:pos="720"/>
+        </w:tabs>
+        <w:ind w:left="720" w:hanging="360"/>
+      </w:pPr>
+      <w:rPr>
+        <w:rFonts w:ascii="Symbol" w:hAnsi="Symbol" w:hint="default"/>
+        <w:sz w:val="20"/>
+      </w:rPr>
+    </w:lvl>
+    <w:lvl w:ilvl="1" w:tentative="1">
+      <w:start w:val="1"/>
+      <w:numFmt w:val="bullet"/>
+      <w:lvlText w:val="o"/>
+      <w:lvlJc w:val="left"/>
+      <w:pPr>
+        <w:tabs>
+          <w:tab w:val="num" w:pos="1440"/>
+        </w:tabs>
+        <w:ind w:left="1440" w:hanging="360"/>
+      </w:pPr>
+      <w:rPr>
+        <w:rFonts w:ascii="Courier New" w:hAnsi="Courier New" w:hint="default"/>
+        <w:sz w:val="20"/>
+      </w:rPr>
+    </w:lvl>
+    <w:lvl w:ilvl="2" w:tentative="1">
+      <w:start w:val="1"/>
+      <w:numFmt w:val="bullet"/>
+      <w:lvlText w:val=""/>
+      <w:lvlJc w:val="left"/>
+      <w:pPr>
+        <w:tabs>
+          <w:tab w:val="num" w:pos="2160"/>
+        </w:tabs>
+        <w:ind w:left="2160" w:hanging="360"/>
+      </w:pPr>
+      <w:rPr>
+        <w:rFonts w:ascii="Wingdings" w:hAnsi="Wingdings" w:hint="default"/>
+        <w:sz w:val="20"/>
+      </w:rPr>
+    </w:lvl>
+    <w:lvl w:ilvl="3" w:tentative="1">
+      <w:start w:val="1"/>
+      <w:numFmt w:val="bullet"/>
+      <w:lvlText w:val=""/>
+      <w:lvlJc w:val="left"/>
+      <w:pPr>
+        <w:tabs>
+          <w:tab w:val="num" w:pos="2880"/>
+        </w:tabs>
+        <w:ind w:left="2880" w:hanging="360"/>
+      </w:pPr>
+      <w:rPr>
+        <w:rFonts w:ascii="Wingdings" w:hAnsi="Wingdings" w:hint="default"/>
+        <w:sz w:val="20"/>
+      </w:rPr>
+    </w:lvl>
+    <w:lvl w:ilvl="4" w:tentative="1">
+      <w:start w:val="1"/>
+      <w:numFmt w:val="bullet"/>
+      <w:lvlText w:val=""/>
+      <w:lvlJc w:val="left"/>
+      <w:pPr>
+        <w:tabs>
+          <w:tab w:val="num" w:pos="3600"/>
+        </w:tabs>
+        <w:ind w:left="3600" w:hanging="360"/>
+      </w:pPr>
+      <w:rPr>
+        <w:rFonts w:ascii="Wingdings" w:hAnsi="Wingdings" w:hint="default"/>
+        <w:sz w:val="20"/>
+      </w:rPr>
+    </w:lvl>
+    <w:lvl w:ilvl="5" w:tentative="1">
+      <w:start w:val="1"/>
+      <w:numFmt w:val="bullet"/>
+      <w:lvlText w:val=""/>
+      <w:lvlJc w:val="left"/>
+      <w:pPr>
+        <w:tabs>
+          <w:tab w:val="num" w:pos="4320"/>
+        </w:tabs>
+        <w:ind w:left="4320" w:hanging="360"/>
+      </w:pPr>
+      <w:rPr>
+        <w:rFonts w:ascii="Wingdings" w:hAnsi="Wingdings" w:hint="default"/>
+        <w:sz w:val="20"/>
+      </w:rPr>
+    </w:lvl>
+    <w:lvl w:ilvl="6" w:tentative="1">
+      <w:start w:val="1"/>
+      <w:numFmt w:val="bullet"/>
+      <w:lvlText w:val=""/>
+      <w:lvlJc w:val="left"/>
+      <w:pPr>
+        <w:tabs>
+          <w:tab w:val="num" w:pos="5040"/>
+        </w:tabs>
+        <w:ind w:left="5040" w:hanging="360"/>
+      </w:pPr>
+      <w:rPr>
+        <w:rFonts w:ascii="Wingdings" w:hAnsi="Wingdings" w:hint="default"/>
+        <w:sz w:val="20"/>
+      </w:rPr>
+    </w:lvl>
+    <w:lvl w:ilvl="7" w:tentative="1">
+      <w:start w:val="1"/>
+      <w:numFmt w:val="bullet"/>
+      <w:lvlText w:val=""/>
+      <w:lvlJc w:val="left"/>
+      <w:pPr>
+        <w:tabs>
+          <w:tab w:val="num" w:pos="5760"/>
+        </w:tabs>
+        <w:ind w:left="5760" w:hanging="360"/>
+      </w:pPr>
+      <w:rPr>
+        <w:rFonts w:ascii="Wingdings" w:hAnsi="Wingdings" w:hint="default"/>
+        <w:sz w:val="20"/>
+      </w:rPr>
+    </w:lvl>
+    <w:lvl w:ilvl="8" w:tentative="1">
+      <w:start w:val="1"/>
+      <w:numFmt w:val="bullet"/>
+      <w:lvlText w:val=""/>
+      <w:lvlJc w:val="left"/>
+      <w:pPr>
+        <w:tabs>
+          <w:tab w:val="num" w:pos="6480"/>
+        </w:tabs>
+        <w:ind w:left="6480" w:hanging="360"/>
+      </w:pPr>
+      <w:rPr>
+        <w:rFonts w:ascii="Wingdings" w:hAnsi="Wingdings" w:hint="default"/>
+        <w:sz w:val="20"/>
+      </w:rPr>
+    </w:lvl>
+  </w:abstractNum>
+  <w:abstractNum w:abstractNumId="9" w15:restartNumberingAfterBreak="0">
     <w:nsid w:val="25393C7A"/>
     <w:multiLevelType w:val="multilevel"/>
     <w:tmpl w:val="9A0EB974"/>
@@ -3120,7 +3624,7 @@
       </w:rPr>
     </w:lvl>
   </w:abstractNum>
-  <w:abstractNum w:abstractNumId="9" w15:restartNumberingAfterBreak="0">
+  <w:abstractNum w:abstractNumId="10" w15:restartNumberingAfterBreak="0">
     <w:nsid w:val="2E2E47EF"/>
     <w:multiLevelType w:val="multilevel"/>
     <w:tmpl w:val="D42ADA08"/>
@@ -3269,7 +3773,7 @@
       </w:rPr>
     </w:lvl>
   </w:abstractNum>
-  <w:abstractNum w:abstractNumId="10" w15:restartNumberingAfterBreak="0">
+  <w:abstractNum w:abstractNumId="11" w15:restartNumberingAfterBreak="0">
     <w:nsid w:val="36D00FF2"/>
     <w:multiLevelType w:val="multilevel"/>
     <w:tmpl w:val="CD888094"/>
@@ -3418,7 +3922,7 @@
       </w:rPr>
     </w:lvl>
   </w:abstractNum>
-  <w:abstractNum w:abstractNumId="11" w15:restartNumberingAfterBreak="0">
+  <w:abstractNum w:abstractNumId="12" w15:restartNumberingAfterBreak="0">
     <w:nsid w:val="36FA652A"/>
     <w:multiLevelType w:val="multilevel"/>
     <w:tmpl w:val="88C6B9B2"/>
@@ -3567,7 +4071,7 @@
       </w:rPr>
     </w:lvl>
   </w:abstractNum>
-  <w:abstractNum w:abstractNumId="12" w15:restartNumberingAfterBreak="0">
+  <w:abstractNum w:abstractNumId="13" w15:restartNumberingAfterBreak="0">
     <w:nsid w:val="3E755E08"/>
     <w:multiLevelType w:val="multilevel"/>
     <w:tmpl w:val="377C16D6"/>
@@ -3716,7 +4220,7 @@
       </w:rPr>
     </w:lvl>
   </w:abstractNum>
-  <w:abstractNum w:abstractNumId="13" w15:restartNumberingAfterBreak="0">
+  <w:abstractNum w:abstractNumId="14" w15:restartNumberingAfterBreak="0">
     <w:nsid w:val="4FED03CC"/>
     <w:multiLevelType w:val="multilevel"/>
     <w:tmpl w:val="984E8636"/>
@@ -3865,7 +4369,7 @@
       </w:rPr>
     </w:lvl>
   </w:abstractNum>
-  <w:abstractNum w:abstractNumId="14" w15:restartNumberingAfterBreak="0">
+  <w:abstractNum w:abstractNumId="15" w15:restartNumberingAfterBreak="0">
     <w:nsid w:val="52D50DBB"/>
     <w:multiLevelType w:val="multilevel"/>
     <w:tmpl w:val="F712FE74"/>
@@ -4014,7 +4518,7 @@
       </w:rPr>
     </w:lvl>
   </w:abstractNum>
-  <w:abstractNum w:abstractNumId="15" w15:restartNumberingAfterBreak="0">
+  <w:abstractNum w:abstractNumId="16" w15:restartNumberingAfterBreak="0">
     <w:nsid w:val="55FE3C7A"/>
     <w:multiLevelType w:val="multilevel"/>
     <w:tmpl w:val="ACD85E2C"/>
@@ -4163,7 +4667,7 @@
       </w:rPr>
     </w:lvl>
   </w:abstractNum>
-  <w:abstractNum w:abstractNumId="16" w15:restartNumberingAfterBreak="0">
+  <w:abstractNum w:abstractNumId="17" w15:restartNumberingAfterBreak="0">
     <w:nsid w:val="59CA6CB7"/>
     <w:multiLevelType w:val="multilevel"/>
     <w:tmpl w:val="0A6C2D78"/>
@@ -4312,7 +4816,7 @@
       </w:rPr>
     </w:lvl>
   </w:abstractNum>
-  <w:abstractNum w:abstractNumId="17" w15:restartNumberingAfterBreak="0">
+  <w:abstractNum w:abstractNumId="18" w15:restartNumberingAfterBreak="0">
     <w:nsid w:val="62592C20"/>
     <w:multiLevelType w:val="multilevel"/>
     <w:tmpl w:val="FA4E3564"/>
@@ -4461,7 +4965,7 @@
       </w:rPr>
     </w:lvl>
   </w:abstractNum>
-  <w:abstractNum w:abstractNumId="18" w15:restartNumberingAfterBreak="0">
+  <w:abstractNum w:abstractNumId="19" w15:restartNumberingAfterBreak="0">
     <w:nsid w:val="63D1084B"/>
     <w:multiLevelType w:val="multilevel"/>
     <w:tmpl w:val="CD5E3CB8"/>
@@ -4610,7 +5114,7 @@
       </w:rPr>
     </w:lvl>
   </w:abstractNum>
-  <w:abstractNum w:abstractNumId="19" w15:restartNumberingAfterBreak="0">
+  <w:abstractNum w:abstractNumId="20" w15:restartNumberingAfterBreak="0">
     <w:nsid w:val="659674EF"/>
     <w:multiLevelType w:val="multilevel"/>
     <w:tmpl w:val="A0EAAD0E"/>
@@ -4759,7 +5263,7 @@
       </w:rPr>
     </w:lvl>
   </w:abstractNum>
-  <w:abstractNum w:abstractNumId="20" w15:restartNumberingAfterBreak="0">
+  <w:abstractNum w:abstractNumId="21" w15:restartNumberingAfterBreak="0">
     <w:nsid w:val="661E5E4B"/>
     <w:multiLevelType w:val="multilevel"/>
     <w:tmpl w:val="4FA02260"/>
@@ -4908,7 +5412,7 @@
       </w:rPr>
     </w:lvl>
   </w:abstractNum>
-  <w:abstractNum w:abstractNumId="21" w15:restartNumberingAfterBreak="0">
+  <w:abstractNum w:abstractNumId="22" w15:restartNumberingAfterBreak="0">
     <w:nsid w:val="6AD42356"/>
     <w:multiLevelType w:val="multilevel"/>
     <w:tmpl w:val="A402836C"/>
@@ -5057,7 +5561,7 @@
       </w:rPr>
     </w:lvl>
   </w:abstractNum>
-  <w:abstractNum w:abstractNumId="22" w15:restartNumberingAfterBreak="0">
+  <w:abstractNum w:abstractNumId="23" w15:restartNumberingAfterBreak="0">
     <w:nsid w:val="71384A5B"/>
     <w:multiLevelType w:val="multilevel"/>
     <w:tmpl w:val="A1500B8C"/>
@@ -5206,7 +5710,7 @@
       </w:rPr>
     </w:lvl>
   </w:abstractNum>
-  <w:abstractNum w:abstractNumId="23" w15:restartNumberingAfterBreak="0">
+  <w:abstractNum w:abstractNumId="24" w15:restartNumberingAfterBreak="0">
     <w:nsid w:val="7163261A"/>
     <w:multiLevelType w:val="multilevel"/>
     <w:tmpl w:val="B7F48BFE"/>
@@ -5355,7 +5859,7 @@
       </w:rPr>
     </w:lvl>
   </w:abstractNum>
-  <w:abstractNum w:abstractNumId="24" w15:restartNumberingAfterBreak="0">
+  <w:abstractNum w:abstractNumId="25" w15:restartNumberingAfterBreak="0">
     <w:nsid w:val="734F7B3E"/>
     <w:multiLevelType w:val="multilevel"/>
     <w:tmpl w:val="8D846DC0"/>
@@ -5504,7 +6008,7 @@
       </w:rPr>
     </w:lvl>
   </w:abstractNum>
-  <w:abstractNum w:abstractNumId="25" w15:restartNumberingAfterBreak="0">
+  <w:abstractNum w:abstractNumId="26" w15:restartNumberingAfterBreak="0">
     <w:nsid w:val="73F72DB5"/>
     <w:multiLevelType w:val="multilevel"/>
     <w:tmpl w:val="48DA385E"/>
@@ -5653,7 +6157,7 @@
       </w:rPr>
     </w:lvl>
   </w:abstractNum>
-  <w:abstractNum w:abstractNumId="26" w15:restartNumberingAfterBreak="0">
+  <w:abstractNum w:abstractNumId="27" w15:restartNumberingAfterBreak="0">
     <w:nsid w:val="75686CEA"/>
     <w:multiLevelType w:val="multilevel"/>
     <w:tmpl w:val="43DEEB12"/>
@@ -5802,7 +6306,7 @@
       </w:rPr>
     </w:lvl>
   </w:abstractNum>
-  <w:abstractNum w:abstractNumId="27" w15:restartNumberingAfterBreak="0">
+  <w:abstractNum w:abstractNumId="28" w15:restartNumberingAfterBreak="0">
     <w:nsid w:val="7DE50144"/>
     <w:multiLevelType w:val="multilevel"/>
     <w:tmpl w:val="75A01784"/>
@@ -5955,58 +6459,58 @@
     <w:abstractNumId w:val="2"/>
   </w:num>
   <w:num w:numId="2" w16cid:durableId="1413353839">
-    <w:abstractNumId w:val="27"/>
+    <w:abstractNumId w:val="28"/>
   </w:num>
   <w:num w:numId="3" w16cid:durableId="1663465380">
-    <w:abstractNumId w:val="25"/>
+    <w:abstractNumId w:val="26"/>
   </w:num>
   <w:num w:numId="4" w16cid:durableId="965156162">
     <w:abstractNumId w:val="6"/>
   </w:num>
   <w:num w:numId="5" w16cid:durableId="434399921">
-    <w:abstractNumId w:val="10"/>
+    <w:abstractNumId w:val="11"/>
   </w:num>
   <w:num w:numId="6" w16cid:durableId="683240848">
-    <w:abstractNumId w:val="15"/>
+    <w:abstractNumId w:val="16"/>
   </w:num>
   <w:num w:numId="7" w16cid:durableId="973365980">
-    <w:abstractNumId w:val="22"/>
+    <w:abstractNumId w:val="23"/>
   </w:num>
   <w:num w:numId="8" w16cid:durableId="253781238">
-    <w:abstractNumId w:val="20"/>
+    <w:abstractNumId w:val="21"/>
   </w:num>
   <w:num w:numId="9" w16cid:durableId="1870070149">
-    <w:abstractNumId w:val="9"/>
+    <w:abstractNumId w:val="10"/>
   </w:num>
   <w:num w:numId="10" w16cid:durableId="1882203272">
     <w:abstractNumId w:val="1"/>
   </w:num>
   <w:num w:numId="11" w16cid:durableId="755979233">
-    <w:abstractNumId w:val="11"/>
+    <w:abstractNumId w:val="12"/>
   </w:num>
   <w:num w:numId="12" w16cid:durableId="1694650986">
     <w:abstractNumId w:val="7"/>
   </w:num>
   <w:num w:numId="13" w16cid:durableId="494536832">
-    <w:abstractNumId w:val="23"/>
+    <w:abstractNumId w:val="24"/>
   </w:num>
   <w:num w:numId="14" w16cid:durableId="518810851">
-    <w:abstractNumId w:val="14"/>
+    <w:abstractNumId w:val="15"/>
   </w:num>
   <w:num w:numId="15" w16cid:durableId="341057319">
     <w:abstractNumId w:val="0"/>
   </w:num>
   <w:num w:numId="16" w16cid:durableId="1884176955">
-    <w:abstractNumId w:val="16"/>
+    <w:abstractNumId w:val="17"/>
   </w:num>
   <w:num w:numId="17" w16cid:durableId="428045392">
     <w:abstractNumId w:val="5"/>
   </w:num>
   <w:num w:numId="18" w16cid:durableId="840852284">
-    <w:abstractNumId w:val="21"/>
+    <w:abstractNumId w:val="22"/>
   </w:num>
   <w:num w:numId="19" w16cid:durableId="618532611">
-    <w:abstractNumId w:val="13"/>
+    <w:abstractNumId w:val="14"/>
   </w:num>
   <w:num w:numId="20" w16cid:durableId="1468864136">
     <w:abstractNumId w:val="4"/>
@@ -6015,25 +6519,28 @@
     <w:abstractNumId w:val="3"/>
   </w:num>
   <w:num w:numId="22" w16cid:durableId="1371153629">
-    <w:abstractNumId w:val="26"/>
+    <w:abstractNumId w:val="27"/>
   </w:num>
   <w:num w:numId="23" w16cid:durableId="1535382914">
+    <w:abstractNumId w:val="19"/>
+  </w:num>
+  <w:num w:numId="24" w16cid:durableId="1695884592">
     <w:abstractNumId w:val="18"/>
   </w:num>
-  <w:num w:numId="24" w16cid:durableId="1695884592">
-    <w:abstractNumId w:val="17"/>
-  </w:num>
   <w:num w:numId="25" w16cid:durableId="1243876387">
-    <w:abstractNumId w:val="19"/>
+    <w:abstractNumId w:val="20"/>
   </w:num>
   <w:num w:numId="26" w16cid:durableId="850026099">
-    <w:abstractNumId w:val="12"/>
+    <w:abstractNumId w:val="13"/>
   </w:num>
   <w:num w:numId="27" w16cid:durableId="395322571">
-    <w:abstractNumId w:val="8"/>
+    <w:abstractNumId w:val="9"/>
   </w:num>
   <w:num w:numId="28" w16cid:durableId="2066483070">
-    <w:abstractNumId w:val="24"/>
+    <w:abstractNumId w:val="25"/>
+  </w:num>
+  <w:num w:numId="29" w16cid:durableId="1628857577">
+    <w:abstractNumId w:val="8"/>
   </w:num>
 </w:numbering>
 </file>
@@ -6489,7 +6996,6 @@
     <w:next w:val="Normal"/>
     <w:link w:val="Heading3Char"/>
     <w:uiPriority w:val="9"/>
-    <w:semiHidden/>
     <w:unhideWhenUsed/>
     <w:qFormat/>
     <w:rsid w:val="004C24D3"/>
@@ -6696,7 +7202,6 @@
     <w:basedOn w:val="DefaultParagraphFont"/>
     <w:link w:val="Heading3"/>
     <w:uiPriority w:val="9"/>
-    <w:semiHidden/>
     <w:rsid w:val="004C24D3"/>
     <w:rPr>
       <w:rFonts w:eastAsiaTheme="majorEastAsia" w:cstheme="majorBidi"/>
@@ -6952,6 +7457,17 @@
       <w:smallCaps/>
       <w:color w:val="0F4761" w:themeColor="accent1" w:themeShade="BF"/>
       <w:spacing w:val="5"/>
+    </w:rPr>
+  </w:style>
+  <w:style w:type="character" w:styleId="Strong">
+    <w:name w:val="Strong"/>
+    <w:basedOn w:val="DefaultParagraphFont"/>
+    <w:uiPriority w:val="22"/>
+    <w:qFormat/>
+    <w:rsid w:val="00D96FED"/>
+    <w:rPr>
+      <w:b/>
+      <w:bCs/>
     </w:rPr>
   </w:style>
 </w:styles>

</xml_diff>